<commit_message>
added multiplayer functionality and initial mechanics
</commit_message>
<xml_diff>
--- a/Assets/Pigeon_vs_Seagull_Game_Design_Document.docx
+++ b/Assets/Pigeon_vs_Seagull_Game_Design_Document.docx
@@ -1743,192 +1743,6 @@
                 <w:b w:val="0"/>
                 <w:sz w:val="18"/>
               </w:rPr>
-              <w:t>Pizza / hot dog / fries</w:t>
-            </w:r>
-          </w:p>
-        </w:tc>
-        <w:tc>
-          <w:tcPr>
-            <w:tcW w:type="dxa" w:w="2520"/>
-          </w:tcPr>
-          <w:p>
-            <w:r/>
-            <w:r>
-              <w:rPr>
-                <w:b w:val="0"/>
-                <w:sz w:val="18"/>
-              </w:rPr>
-              <w:t>Short speed boost; can contribute to Status</w:t>
-            </w:r>
-          </w:p>
-        </w:tc>
-        <w:tc>
-          <w:tcPr>
-            <w:tcW w:type="dxa" w:w="2520"/>
-          </w:tcPr>
-          <w:p>
-            <w:r/>
-            <w:r>
-              <w:rPr>
-                <w:b w:val="0"/>
-                <w:sz w:val="18"/>
-              </w:rPr>
-              <w:t>Movement</w:t>
-            </w:r>
-          </w:p>
-        </w:tc>
-        <w:tc>
-          <w:tcPr>
-            <w:tcW w:type="dxa" w:w="2520"/>
-          </w:tcPr>
-          <w:p>
-            <w:r/>
-            <w:r>
-              <w:rPr>
-                <w:b w:val="0"/>
-                <w:sz w:val="18"/>
-              </w:rPr>
-              <w:t>Requires a brief consume interaction.</w:t>
-            </w:r>
-          </w:p>
-        </w:tc>
-      </w:tr>
-      <w:tr>
-        <w:tc>
-          <w:tcPr>
-            <w:tcW w:type="dxa" w:w="2520"/>
-          </w:tcPr>
-          <w:p>
-            <w:r/>
-            <w:r>
-              <w:rPr>
-                <w:b w:val="0"/>
-                <w:sz w:val="18"/>
-              </w:rPr>
-              <w:t>Bagel</w:t>
-            </w:r>
-          </w:p>
-        </w:tc>
-        <w:tc>
-          <w:tcPr>
-            <w:tcW w:type="dxa" w:w="2520"/>
-          </w:tcPr>
-          <w:p>
-            <w:r/>
-            <w:r>
-              <w:rPr>
-                <w:b w:val="0"/>
-                <w:sz w:val="18"/>
-              </w:rPr>
-              <w:t>Immediately restores the three-jump chain</w:t>
-            </w:r>
-          </w:p>
-        </w:tc>
-        <w:tc>
-          <w:tcPr>
-            <w:tcW w:type="dxa" w:w="2520"/>
-          </w:tcPr>
-          <w:p>
-            <w:r/>
-            <w:r>
-              <w:rPr>
-                <w:b w:val="0"/>
-                <w:sz w:val="18"/>
-              </w:rPr>
-              <w:t>Movement</w:t>
-            </w:r>
-          </w:p>
-        </w:tc>
-        <w:tc>
-          <w:tcPr>
-            <w:tcW w:type="dxa" w:w="2520"/>
-          </w:tcPr>
-          <w:p>
-            <w:r/>
-            <w:r>
-              <w:rPr>
-                <w:b w:val="0"/>
-                <w:sz w:val="18"/>
-              </w:rPr>
-              <w:t>Best when caught grounded.</w:t>
-            </w:r>
-          </w:p>
-        </w:tc>
-      </w:tr>
-      <w:tr>
-        <w:tc>
-          <w:tcPr>
-            <w:tcW w:type="dxa" w:w="2520"/>
-          </w:tcPr>
-          <w:p>
-            <w:r/>
-            <w:r>
-              <w:rPr>
-                <w:b w:val="0"/>
-                <w:sz w:val="18"/>
-              </w:rPr>
-              <w:t>Coffee</w:t>
-            </w:r>
-          </w:p>
-        </w:tc>
-        <w:tc>
-          <w:tcPr>
-            <w:tcW w:type="dxa" w:w="2520"/>
-          </w:tcPr>
-          <w:p>
-            <w:r/>
-            <w:r>
-              <w:rPr>
-                <w:b w:val="0"/>
-                <w:sz w:val="18"/>
-              </w:rPr>
-              <w:t>Faster jump recovery or temporary fourth jump</w:t>
-            </w:r>
-          </w:p>
-        </w:tc>
-        <w:tc>
-          <w:tcPr>
-            <w:tcW w:type="dxa" w:w="2520"/>
-          </w:tcPr>
-          <w:p>
-            <w:r/>
-            <w:r>
-              <w:rPr>
-                <w:b w:val="0"/>
-                <w:sz w:val="18"/>
-              </w:rPr>
-              <w:t>Movement</w:t>
-            </w:r>
-          </w:p>
-        </w:tc>
-        <w:tc>
-          <w:tcPr>
-            <w:tcW w:type="dxa" w:w="2520"/>
-          </w:tcPr>
-          <w:p>
-            <w:r/>
-            <w:r>
-              <w:rPr>
-                <w:b w:val="0"/>
-                <w:sz w:val="18"/>
-              </w:rPr>
-              <w:t>Can make handling twitchier.</w:t>
-            </w:r>
-          </w:p>
-        </w:tc>
-      </w:tr>
-      <w:tr>
-        <w:tc>
-          <w:tcPr>
-            <w:tcW w:type="dxa" w:w="2520"/>
-          </w:tcPr>
-          <w:p>
-            <w:r/>
-            <w:r>
-              <w:rPr>
-                <w:b w:val="0"/>
-                <w:sz w:val="18"/>
-              </w:rPr>
               <w:t>Chess piece</w:t>
             </w:r>
           </w:p>
@@ -2223,130 +2037,6 @@
                 <w:sz w:val="18"/>
               </w:rPr>
               <w:t>Defensive counter-item.</w:t>
-            </w:r>
-          </w:p>
-        </w:tc>
-      </w:tr>
-      <w:tr>
-        <w:tc>
-          <w:tcPr>
-            <w:tcW w:type="dxa" w:w="2520"/>
-          </w:tcPr>
-          <w:p>
-            <w:r/>
-            <w:r>
-              <w:rPr>
-                <w:b w:val="0"/>
-                <w:sz w:val="18"/>
-              </w:rPr>
-              <w:t>Bread</w:t>
-            </w:r>
-          </w:p>
-        </w:tc>
-        <w:tc>
-          <w:tcPr>
-            <w:tcW w:type="dxa" w:w="2520"/>
-          </w:tcPr>
-          <w:p>
-            <w:r/>
-            <w:r>
-              <w:rPr>
-                <w:b w:val="0"/>
-                <w:sz w:val="18"/>
-              </w:rPr>
-              <w:t>Summons an NPC bird flock</w:t>
-            </w:r>
-          </w:p>
-        </w:tc>
-        <w:tc>
-          <w:tcPr>
-            <w:tcW w:type="dxa" w:w="2520"/>
-          </w:tcPr>
-          <w:p>
-            <w:r/>
-            <w:r>
-              <w:rPr>
-                <w:b w:val="0"/>
-                <w:sz w:val="18"/>
-              </w:rPr>
-              <w:t>Chaos</w:t>
-            </w:r>
-          </w:p>
-        </w:tc>
-        <w:tc>
-          <w:tcPr>
-            <w:tcW w:type="dxa" w:w="2520"/>
-          </w:tcPr>
-          <w:p>
-            <w:r/>
-            <w:r>
-              <w:rPr>
-                <w:b w:val="0"/>
-                <w:sz w:val="18"/>
-              </w:rPr>
-              <w:t>Both players can exploit the visual cover.</w:t>
-            </w:r>
-          </w:p>
-        </w:tc>
-      </w:tr>
-      <w:tr>
-        <w:tc>
-          <w:tcPr>
-            <w:tcW w:type="dxa" w:w="2520"/>
-          </w:tcPr>
-          <w:p>
-            <w:r/>
-            <w:r>
-              <w:rPr>
-                <w:b w:val="0"/>
-                <w:sz w:val="18"/>
-              </w:rPr>
-              <w:t>French fries</w:t>
-            </w:r>
-          </w:p>
-        </w:tc>
-        <w:tc>
-          <w:tcPr>
-            <w:tcW w:type="dxa" w:w="2520"/>
-          </w:tcPr>
-          <w:p>
-            <w:r/>
-            <w:r>
-              <w:rPr>
-                <w:b w:val="0"/>
-                <w:sz w:val="18"/>
-              </w:rPr>
-              <w:t>Creates an NPC-bird attraction point/trail</w:t>
-            </w:r>
-          </w:p>
-        </w:tc>
-        <w:tc>
-          <w:tcPr>
-            <w:tcW w:type="dxa" w:w="2520"/>
-          </w:tcPr>
-          <w:p>
-            <w:r/>
-            <w:r>
-              <w:rPr>
-                <w:b w:val="0"/>
-                <w:sz w:val="18"/>
-              </w:rPr>
-              <w:t>Chaos</w:t>
-            </w:r>
-          </w:p>
-        </w:tc>
-        <w:tc>
-          <w:tcPr>
-            <w:tcW w:type="dxa" w:w="2520"/>
-          </w:tcPr>
-          <w:p>
-            <w:r/>
-            <w:r>
-              <w:rPr>
-                <w:b w:val="0"/>
-                <w:sz w:val="18"/>
-              </w:rPr>
-              <w:t>Can also obstruct your own route.</w:t>
             </w:r>
           </w:p>
         </w:tc>
@@ -2726,6 +2416,1345 @@
     </w:tbl>
     <w:p>
       <w:pPr>
+        <w:pStyle w:val="Heading2"/>
+      </w:pPr>
+      <w:r>
+        <w:t>Food</w:t>
+      </w:r>
+    </w:p>
+    <w:p>
+      <w:r>
+        <w:t xml:space="preserve">Food is the most common item type and every vendor in the park serves at least one. Eating a food either gives its ability at once for a set number of seconds (timed foods), or puts it in a stash to use later (ice cream, bread, bagel, pizza). Each ability helps both roles, in different ways, and each has a cost so no food is always the right pick. Food is always eaten on the spot.</w:t>
+      </w:r>
+    </w:p>
+    <w:p>
+      <w:pPr>
+        <w:pStyle w:val="ListBullet"/>
+        <w:spacing w:after="40"/>
+      </w:pPr>
+      <w:r>
+        <w:t xml:space="preserve">One timed ability at a time: eating another timed food replaces it. The stash holds up to 5 of each stashed food. Ice cream and bread go off on their own key, a bagel by itself on the next hit, and a pizza by itself the next time the bird rides someone. The HUD shows the timer and the stash.</w:t>
+      </w:r>
+    </w:p>
+    <w:p>
+      <w:pPr>
+        <w:pStyle w:val="ListBullet"/>
+        <w:spacing w:after="40"/>
+      </w:pPr>
+      <w:r>
+        <w:t xml:space="preserve">The ability shows on the bird (steam, hot-sauce glow, a trailing flock) so the other player can read it.</w:t>
+      </w:r>
+    </w:p>
+    <w:p>
+      <w:pPr>
+        <w:pStyle w:val="ListBullet"/>
+        <w:spacing w:after="40"/>
+      </w:pPr>
+      <w:r>
+        <w:t xml:space="preserve">Dying ends the timed ability and empties the stash. For the Pigeon, eating any food also adds a little Status.</w:t>
+      </w:r>
+    </w:p>
+    <w:tbl>
+      <w:tblPr>
+        <w:tblStyle w:val="TableGrid"/>
+        <w:tblW w:type="auto" w:w="0"/>
+        <w:jc w:val="center"/>
+        <w:tblLook w:firstColumn="1" w:firstRow="1" w:lastColumn="0" w:lastRow="0" w:noHBand="0" w:noVBand="1" w:val="04A0"/>
+      </w:tblPr>
+      <w:tblGrid>
+        <w:gridCol w:w="1800"/>
+        <w:gridCol w:w="2280"/>
+        <w:gridCol w:w="2000"/>
+        <w:gridCol w:w="2000"/>
+        <w:gridCol w:w="2000"/>
+      </w:tblGrid>
+      <w:tr>
+        <w:tc>
+          <w:tcPr>
+            <w:tcW w:type="dxa" w:w="1800"/>
+            <w:shd w:fill="E2F0D9"/>
+          </w:tcPr>
+          <w:p>
+            <w:r/>
+            <w:r>
+              <w:rPr>
+                <w:b/>
+                <w:sz w:val="18"/>
+              </w:rPr>
+              <w:t xml:space="preserve">Food (where)</w:t>
+            </w:r>
+          </w:p>
+        </w:tc>
+        <w:tc>
+          <w:tcPr>
+            <w:tcW w:type="dxa" w:w="2280"/>
+            <w:shd w:fill="E2F0D9"/>
+          </w:tcPr>
+          <w:p>
+            <w:r/>
+            <w:r>
+              <w:rPr>
+                <w:b/>
+                <w:sz w:val="18"/>
+              </w:rPr>
+              <w:t xml:space="preserve">Ability, how long</w:t>
+            </w:r>
+          </w:p>
+        </w:tc>
+        <w:tc>
+          <w:tcPr>
+            <w:tcW w:type="dxa" w:w="2000"/>
+            <w:shd w:fill="E2F0D9"/>
+          </w:tcPr>
+          <w:p>
+            <w:r/>
+            <w:r>
+              <w:rPr>
+                <w:b/>
+                <w:sz w:val="18"/>
+              </w:rPr>
+              <w:t xml:space="preserve">Pigeon (hunter) uses it to</w:t>
+            </w:r>
+          </w:p>
+        </w:tc>
+        <w:tc>
+          <w:tcPr>
+            <w:tcW w:type="dxa" w:w="2000"/>
+            <w:shd w:fill="E2F0D9"/>
+          </w:tcPr>
+          <w:p>
+            <w:r/>
+            <w:r>
+              <w:rPr>
+                <w:b/>
+                <w:sz w:val="18"/>
+              </w:rPr>
+              <w:t xml:space="preserve">Seagull (hunted) uses it to</w:t>
+            </w:r>
+          </w:p>
+        </w:tc>
+        <w:tc>
+          <w:tcPr>
+            <w:tcW w:type="dxa" w:w="2000"/>
+            <w:shd w:fill="E2F0D9"/>
+          </w:tcPr>
+          <w:p>
+            <w:r/>
+            <w:r>
+              <w:rPr>
+                <w:b/>
+                <w:sz w:val="18"/>
+              </w:rPr>
+              <w:t xml:space="preserve">Tradeoff</w:t>
+            </w:r>
+          </w:p>
+        </w:tc>
+      </w:tr>
+      <w:tr>
+        <w:tc>
+          <w:tcPr>
+            <w:tcW w:type="dxa" w:w="1800"/>
+          </w:tcPr>
+          <w:p>
+            <w:r/>
+            <w:r>
+              <w:rPr>
+                <w:b w:val="0"/>
+                <w:sz w:val="18"/>
+              </w:rPr>
+              <w:t xml:space="preserve">Hot dog (hot dog carts)</w:t>
+            </w:r>
+          </w:p>
+        </w:tc>
+        <w:tc>
+          <w:tcPr>
+            <w:tcW w:type="dxa" w:w="2280"/>
+          </w:tcPr>
+          <w:p>
+            <w:r/>
+            <w:r>
+              <w:rPr>
+                <w:b w:val="0"/>
+                <w:sz w:val="18"/>
+              </w:rPr>
+              <w:t xml:space="preserve">Sprint: much faster on the ground. 8 s</w:t>
+            </w:r>
+          </w:p>
+        </w:tc>
+        <w:tc>
+          <w:tcPr>
+            <w:tcW w:type="dxa" w:w="2000"/>
+          </w:tcPr>
+          <w:p>
+            <w:r/>
+            <w:r>
+              <w:rPr>
+                <w:b w:val="0"/>
+                <w:sz w:val="18"/>
+              </w:rPr>
+              <w:t xml:space="preserve">Run down a fleeing Seagull</w:t>
+            </w:r>
+          </w:p>
+        </w:tc>
+        <w:tc>
+          <w:tcPr>
+            <w:tcW w:type="dxa" w:w="2000"/>
+          </w:tcPr>
+          <w:p>
+            <w:r/>
+            <w:r>
+              <w:rPr>
+                <w:b w:val="0"/>
+                <w:sz w:val="18"/>
+              </w:rPr>
+              <w:t xml:space="preserve">Open a gap before crossing open ground</w:t>
+            </w:r>
+          </w:p>
+        </w:tc>
+        <w:tc>
+          <w:tcPr>
+            <w:tcW w:type="dxa" w:w="2000"/>
+          </w:tcPr>
+          <w:p>
+            <w:r/>
+            <w:r>
+              <w:rPr>
+                <w:b w:val="0"/>
+                <w:sz w:val="18"/>
+              </w:rPr>
+              <w:t xml:space="preserve">No help in the air; eating takes about 1.5 s on the spot</w:t>
+            </w:r>
+          </w:p>
+        </w:tc>
+      </w:tr>
+      <w:tr>
+        <w:tc>
+          <w:tcPr>
+            <w:tcW w:type="dxa" w:w="1800"/>
+          </w:tcPr>
+          <w:p>
+            <w:r/>
+            <w:r>
+              <w:rPr>
+                <w:b w:val="0"/>
+                <w:sz w:val="18"/>
+              </w:rPr>
+              <w:t xml:space="preserve">Coffee (coffee carts)</w:t>
+            </w:r>
+          </w:p>
+        </w:tc>
+        <w:tc>
+          <w:tcPr>
+            <w:tcW w:type="dxa" w:w="2280"/>
+          </w:tcPr>
+          <w:p>
+            <w:r/>
+            <w:r>
+              <w:rPr>
+                <w:b w:val="0"/>
+                <w:sz w:val="18"/>
+              </w:rPr>
+              <w:t xml:space="preserve">Jittery wings: a fourth jump and faster jump recovery. 20 s</w:t>
+            </w:r>
+          </w:p>
+        </w:tc>
+        <w:tc>
+          <w:tcPr>
+            <w:tcW w:type="dxa" w:w="2000"/>
+          </w:tcPr>
+          <w:p>
+            <w:r/>
+            <w:r>
+              <w:rPr>
+                <w:b w:val="0"/>
+                <w:sz w:val="18"/>
+              </w:rPr>
+              <w:t xml:space="preserve">Keep up through the air and over crowds</w:t>
+            </w:r>
+          </w:p>
+        </w:tc>
+        <w:tc>
+          <w:tcPr>
+            <w:tcW w:type="dxa" w:w="2000"/>
+          </w:tcPr>
+          <w:p>
+            <w:r/>
+            <w:r>
+              <w:rPr>
+                <w:b w:val="0"/>
+                <w:sz w:val="18"/>
+              </w:rPr>
+              <w:t xml:space="preserve">Escape upward and stay off the ground</w:t>
+            </w:r>
+          </w:p>
+        </w:tc>
+        <w:tc>
+          <w:tcPr>
+            <w:tcW w:type="dxa" w:w="2000"/>
+          </w:tcPr>
+          <w:p>
+            <w:r/>
+            <w:r>
+              <w:rPr>
+                <w:b w:val="0"/>
+                <w:sz w:val="18"/>
+              </w:rPr>
+              <w:t xml:space="preserve">Steering is twitchier while it lasts</w:t>
+            </w:r>
+          </w:p>
+        </w:tc>
+      </w:tr>
+      <w:tr>
+        <w:tc>
+          <w:tcPr>
+            <w:tcW w:type="dxa" w:w="1800"/>
+          </w:tcPr>
+          <w:p>
+            <w:r/>
+            <w:r>
+              <w:rPr>
+                <w:b w:val="0"/>
+                <w:sz w:val="18"/>
+              </w:rPr>
+              <w:t xml:space="preserve">Burrito (Mexican trucks)</w:t>
+            </w:r>
+          </w:p>
+        </w:tc>
+        <w:tc>
+          <w:tcPr>
+            <w:tcW w:type="dxa" w:w="2280"/>
+          </w:tcPr>
+          <w:p>
+            <w:r/>
+            <w:r>
+              <w:rPr>
+                <w:b w:val="0"/>
+                <w:sz w:val="18"/>
+              </w:rPr>
+              <w:t xml:space="preserve">Hot-sauce lunge: every jump becomes a long, low lunge. 10 s</w:t>
+            </w:r>
+          </w:p>
+        </w:tc>
+        <w:tc>
+          <w:tcPr>
+            <w:tcW w:type="dxa" w:w="2000"/>
+          </w:tcPr>
+          <w:p>
+            <w:r/>
+            <w:r>
+              <w:rPr>
+                <w:b w:val="0"/>
+                <w:sz w:val="18"/>
+              </w:rPr>
+              <w:t xml:space="preserve">Pounce on a Seagull busy with a task</w:t>
+            </w:r>
+          </w:p>
+        </w:tc>
+        <w:tc>
+          <w:tcPr>
+            <w:tcW w:type="dxa" w:w="2000"/>
+          </w:tcPr>
+          <w:p>
+            <w:r/>
+            <w:r>
+              <w:rPr>
+                <w:b w:val="0"/>
+                <w:sz w:val="18"/>
+              </w:rPr>
+              <w:t xml:space="preserve">Juke across a gap the Pigeon cannot follow</w:t>
+            </w:r>
+          </w:p>
+        </w:tc>
+        <w:tc>
+          <w:tcPr>
+            <w:tcW w:type="dxa" w:w="2000"/>
+          </w:tcPr>
+          <w:p>
+            <w:r/>
+            <w:r>
+              <w:rPr>
+                <w:b w:val="0"/>
+                <w:sz w:val="18"/>
+              </w:rPr>
+              <w:t xml:space="preserve">Hard to stop or steer; hot-sauce drips mark your path</w:t>
+            </w:r>
+          </w:p>
+        </w:tc>
+      </w:tr>
+      <w:tr>
+        <w:tc>
+          <w:tcPr>
+            <w:tcW w:type="dxa" w:w="1800"/>
+          </w:tcPr>
+          <w:p>
+            <w:r/>
+            <w:r>
+              <w:rPr>
+                <w:b w:val="0"/>
+                <w:sz w:val="18"/>
+              </w:rPr>
+              <w:t xml:space="preserve">Ice cream cone (ice cream trucks)</w:t>
+            </w:r>
+          </w:p>
+        </w:tc>
+        <w:tc>
+          <w:tcPr>
+            <w:tcW w:type="dxa" w:w="2280"/>
+          </w:tcPr>
+          <w:p>
+            <w:r/>
+            <w:r>
+              <w:rPr>
+                <w:b w:val="0"/>
+                <w:sz w:val="18"/>
+              </w:rPr>
+              <w:t xml:space="preserve">Egg bomb (stash, up to 5; own key, any time): blasts you about 15 m straight up, even mid-air or off a person’s head, and hits everyone else within 6 m.</w:t>
+            </w:r>
+          </w:p>
+        </w:tc>
+        <w:tc>
+          <w:tcPr>
+            <w:tcW w:type="dxa" w:w="2000"/>
+          </w:tcPr>
+          <w:p>
+            <w:r/>
+            <w:r>
+              <w:rPr>
+                <w:b w:val="0"/>
+                <w:sz w:val="18"/>
+              </w:rPr>
+              <w:t xml:space="preserve">Drop in on the Seagull from above, or blast it out of a crowd</w:t>
+            </w:r>
+          </w:p>
+        </w:tc>
+        <w:tc>
+          <w:tcPr>
+            <w:tcW w:type="dxa" w:w="2000"/>
+          </w:tcPr>
+          <w:p>
+            <w:r/>
+            <w:r>
+              <w:rPr>
+                <w:b w:val="0"/>
+                <w:sz w:val="18"/>
+              </w:rPr>
+              <w:t xml:space="preserve">Get out of any corner instantly, straight up</w:t>
+            </w:r>
+          </w:p>
+        </w:tc>
+        <w:tc>
+          <w:tcPr>
+            <w:tcW w:type="dxa" w:w="2000"/>
+          </w:tcPr>
+          <w:p>
+            <w:r/>
+            <w:r>
+              <w:rPr>
+                <w:b w:val="0"/>
+                <w:sz w:val="18"/>
+              </w:rPr>
+              <w:t xml:space="preserve">Loud and obvious: the splat on the ground shows where you went up, and it hurts people near you too</w:t>
+            </w:r>
+          </w:p>
+        </w:tc>
+      </w:tr>
+      <w:tr>
+        <w:tc>
+          <w:tcPr>
+            <w:tcW w:type="dxa" w:w="1800"/>
+          </w:tcPr>
+          <w:p>
+            <w:r/>
+            <w:r>
+              <w:rPr>
+                <w:b w:val="0"/>
+                <w:sz w:val="18"/>
+              </w:rPr>
+              <w:t xml:space="preserve">Gyro wrap (halal carts)</w:t>
+            </w:r>
+          </w:p>
+        </w:tc>
+        <w:tc>
+          <w:tcPr>
+            <w:tcW w:type="dxa" w:w="2280"/>
+          </w:tcPr>
+          <w:p>
+            <w:r/>
+            <w:r>
+              <w:rPr>
+                <w:b w:val="0"/>
+                <w:sz w:val="18"/>
+              </w:rPr>
+              <w:t xml:space="preserve">Full belly: take half damage and cannot be knocked back. 20 s</w:t>
+            </w:r>
+          </w:p>
+        </w:tc>
+        <w:tc>
+          <w:tcPr>
+            <w:tcW w:type="dxa" w:w="2000"/>
+          </w:tcPr>
+          <w:p>
+            <w:r/>
+            <w:r>
+              <w:rPr>
+                <w:b w:val="0"/>
+                <w:sz w:val="18"/>
+              </w:rPr>
+              <w:t xml:space="preserve">Push through police fire to stay on the Seagull</w:t>
+            </w:r>
+          </w:p>
+        </w:tc>
+        <w:tc>
+          <w:tcPr>
+            <w:tcW w:type="dxa" w:w="2000"/>
+          </w:tcPr>
+          <w:p>
+            <w:r/>
+            <w:r>
+              <w:rPr>
+                <w:b w:val="0"/>
+                <w:sz w:val="18"/>
+              </w:rPr>
+              <w:t xml:space="preserve">Survive a hit or two from the Pigeon</w:t>
+            </w:r>
+          </w:p>
+        </w:tc>
+        <w:tc>
+          <w:tcPr>
+            <w:tcW w:type="dxa" w:w="2000"/>
+          </w:tcPr>
+          <w:p>
+            <w:r/>
+            <w:r>
+              <w:rPr>
+                <w:b w:val="0"/>
+                <w:sz w:val="18"/>
+              </w:rPr>
+              <w:t xml:space="preserve">Longest eat (about 3 s); jumps are lower while it lasts</w:t>
+            </w:r>
+          </w:p>
+        </w:tc>
+      </w:tr>
+      <w:tr>
+        <w:tc>
+          <w:tcPr>
+            <w:tcW w:type="dxa" w:w="1800"/>
+          </w:tcPr>
+          <w:p>
+            <w:r/>
+            <w:r>
+              <w:rPr>
+                <w:b w:val="0"/>
+                <w:sz w:val="18"/>
+              </w:rPr>
+              <w:t xml:space="preserve">Pizza slice (picnickers)</w:t>
+            </w:r>
+          </w:p>
+        </w:tc>
+        <w:tc>
+          <w:tcPr>
+            <w:tcW w:type="dxa" w:w="2280"/>
+          </w:tcPr>
+          <w:p>
+            <w:r/>
+            <w:r>
+              <w:rPr>
+                <w:b w:val="0"/>
+                <w:sz w:val="18"/>
+              </w:rPr>
+              <w:t xml:space="preserve">Crowd favourite (stash): any person you ride runs faster, and people do not shake you off. 20 s of riding; the clock only runs while you ride and pauses when you hop off</w:t>
+            </w:r>
+          </w:p>
+        </w:tc>
+        <w:tc>
+          <w:tcPr>
+            <w:tcW w:type="dxa" w:w="2000"/>
+          </w:tcPr>
+          <w:p>
+            <w:r/>
+            <w:r>
+              <w:rPr>
+                <w:b w:val="0"/>
+                <w:sz w:val="18"/>
+              </w:rPr>
+              <w:t xml:space="preserve">Run down the Seagull on a fast human</w:t>
+            </w:r>
+          </w:p>
+        </w:tc>
+        <w:tc>
+          <w:tcPr>
+            <w:tcW w:type="dxa" w:w="2000"/>
+          </w:tcPr>
+          <w:p>
+            <w:r/>
+            <w:r>
+              <w:rPr>
+                <w:b w:val="0"/>
+                <w:sz w:val="18"/>
+              </w:rPr>
+              <w:t xml:space="preserve">Escape on a fast human; also counts for the Steal lunch task</w:t>
+            </w:r>
+          </w:p>
+        </w:tc>
+        <w:tc>
+          <w:tcPr>
+            <w:tcW w:type="dxa" w:w="2000"/>
+          </w:tcPr>
+          <w:p>
+            <w:r/>
+            <w:r>
+              <w:rPr>
+                <w:b w:val="0"/>
+                <w:sz w:val="18"/>
+              </w:rPr>
+              <w:t xml:space="preserve">Does nothing until you find someone to ride; snatching it makes the picnicker shout</w:t>
+            </w:r>
+          </w:p>
+        </w:tc>
+      </w:tr>
+      <w:tr>
+        <w:tc>
+          <w:tcPr>
+            <w:tcW w:type="dxa" w:w="1800"/>
+          </w:tcPr>
+          <w:p>
+            <w:r/>
+            <w:r>
+              <w:rPr>
+                <w:b w:val="0"/>
+                <w:sz w:val="18"/>
+              </w:rPr>
+              <w:t xml:space="preserve">Bagel (commuters, bench tops)</w:t>
+            </w:r>
+          </w:p>
+        </w:tc>
+        <w:tc>
+          <w:tcPr>
+            <w:tcW w:type="dxa" w:w="2280"/>
+          </w:tcPr>
+          <w:p>
+            <w:r/>
+            <w:r>
+              <w:rPr>
+                <w:b w:val="0"/>
+                <w:sz w:val="18"/>
+              </w:rPr>
+              <w:t xml:space="preserve">Bagel shield (stash, up to 5): each bagel soaks up one whole hit, used automatically.</w:t>
+            </w:r>
+          </w:p>
+        </w:tc>
+        <w:tc>
+          <w:tcPr>
+            <w:tcW w:type="dxa" w:w="2000"/>
+          </w:tcPr>
+          <w:p>
+            <w:r/>
+            <w:r>
+              <w:rPr>
+                <w:b w:val="0"/>
+                <w:sz w:val="18"/>
+              </w:rPr>
+              <w:t xml:space="preserve">Walk through police fire, or trade shots with the Seagull</w:t>
+            </w:r>
+          </w:p>
+        </w:tc>
+        <w:tc>
+          <w:tcPr>
+            <w:tcW w:type="dxa" w:w="2000"/>
+          </w:tcPr>
+          <w:p>
+            <w:r/>
+            <w:r>
+              <w:rPr>
+                <w:b w:val="0"/>
+                <w:sz w:val="18"/>
+              </w:rPr>
+              <w:t xml:space="preserve">Survive the one hit you couldn’t dodge</w:t>
+            </w:r>
+          </w:p>
+        </w:tc>
+        <w:tc>
+          <w:tcPr>
+            <w:tcW w:type="dxa" w:w="2000"/>
+          </w:tcPr>
+          <w:p>
+            <w:r/>
+            <w:r>
+              <w:rPr>
+                <w:b w:val="0"/>
+                <w:sz w:val="18"/>
+              </w:rPr>
+              <w:t xml:space="preserve">Spent on any hit, even a weak one you didn’t need it for</w:t>
+            </w:r>
+          </w:p>
+        </w:tc>
+      </w:tr>
+      <w:tr>
+        <w:tc>
+          <w:tcPr>
+            <w:tcW w:type="dxa" w:w="1800"/>
+          </w:tcPr>
+          <w:p>
+            <w:r/>
+            <w:r>
+              <w:rPr>
+                <w:b w:val="0"/>
+                <w:sz w:val="18"/>
+              </w:rPr>
+              <w:t xml:space="preserve">Bread (people feeding birds)</w:t>
+            </w:r>
+          </w:p>
+        </w:tc>
+        <w:tc>
+          <w:tcPr>
+            <w:tcW w:type="dxa" w:w="2280"/>
+          </w:tcPr>
+          <w:p>
+            <w:r/>
+            <w:r>
+              <w:rPr>
+                <w:b w:val="0"/>
+                <w:sz w:val="18"/>
+              </w:rPr>
+              <w:t xml:space="preserve">Snitch flock (stash; own key): the nearest flock of park birds flies to the other bird and tails it, and it shows on your minimap. 15 s</w:t>
+            </w:r>
+          </w:p>
+        </w:tc>
+        <w:tc>
+          <w:tcPr>
+            <w:tcW w:type="dxa" w:w="2000"/>
+          </w:tcPr>
+          <w:p>
+            <w:r/>
+            <w:r>
+              <w:rPr>
+                <w:b w:val="0"/>
+                <w:sz w:val="18"/>
+              </w:rPr>
+              <w:t xml:space="preserve">Find a Seagull you have lost</w:t>
+            </w:r>
+          </w:p>
+        </w:tc>
+        <w:tc>
+          <w:tcPr>
+            <w:tcW w:type="dxa" w:w="2000"/>
+          </w:tcPr>
+          <w:p>
+            <w:r/>
+            <w:r>
+              <w:rPr>
+                <w:b w:val="0"/>
+                <w:sz w:val="18"/>
+              </w:rPr>
+              <w:t xml:space="preserve">See which way the Pigeon is coming from</w:t>
+            </w:r>
+          </w:p>
+        </w:tc>
+        <w:tc>
+          <w:tcPr>
+            <w:tcW w:type="dxa" w:w="2000"/>
+          </w:tcPr>
+          <w:p>
+            <w:r/>
+            <w:r>
+              <w:rPr>
+                <w:b w:val="0"/>
+                <w:sz w:val="18"/>
+              </w:rPr>
+              <w:t xml:space="preserve">The other bird sees the flock arrive and knows it has been found</w:t>
+            </w:r>
+          </w:p>
+        </w:tc>
+      </w:tr>
+      <w:tr>
+        <w:tc>
+          <w:tcPr>
+            <w:tcW w:type="dxa" w:w="1800"/>
+          </w:tcPr>
+          <w:p>
+            <w:r/>
+            <w:r>
+              <w:rPr>
+                <w:b w:val="0"/>
+                <w:sz w:val="18"/>
+              </w:rPr>
+              <w:t xml:space="preserve">Soft pretzel (hot dog carts)</w:t>
+            </w:r>
+          </w:p>
+        </w:tc>
+        <w:tc>
+          <w:tcPr>
+            <w:tcW w:type="dxa" w:w="2280"/>
+          </w:tcPr>
+          <w:p>
+            <w:r/>
+            <w:r>
+              <w:rPr>
+                <w:b w:val="0"/>
+                <w:sz w:val="18"/>
+              </w:rPr>
+              <w:t xml:space="preserve">Low profile: people and police ignore your gunshots, and officers already after you give up. 15 s</w:t>
+            </w:r>
+          </w:p>
+        </w:tc>
+        <w:tc>
+          <w:tcPr>
+            <w:tcW w:type="dxa" w:w="2000"/>
+          </w:tcPr>
+          <w:p>
+            <w:r/>
+            <w:r>
+              <w:rPr>
+                <w:b w:val="0"/>
+                <w:sz w:val="18"/>
+              </w:rPr>
+              <w:t xml:space="preserve">Shoot in a crowd without bringing the police</w:t>
+            </w:r>
+          </w:p>
+        </w:tc>
+        <w:tc>
+          <w:tcPr>
+            <w:tcW w:type="dxa" w:w="2000"/>
+          </w:tcPr>
+          <w:p>
+            <w:r/>
+            <w:r>
+              <w:rPr>
+                <w:b w:val="0"/>
+                <w:sz w:val="18"/>
+              </w:rPr>
+              <w:t xml:space="preserve">Shake off officers on your tail</w:t>
+            </w:r>
+          </w:p>
+        </w:tc>
+        <w:tc>
+          <w:tcPr>
+            <w:tcW w:type="dxa" w:w="2000"/>
+          </w:tcPr>
+          <w:p>
+            <w:r/>
+            <w:r>
+              <w:rPr>
+                <w:b w:val="0"/>
+                <w:sz w:val="18"/>
+              </w:rPr>
+              <w:t xml:space="preserve">Birds still scatter at your shots, which gives you away</w:t>
+            </w:r>
+          </w:p>
+        </w:tc>
+      </w:tr>
+    </w:tbl>
+    <w:p>
+      <w:pPr>
+        <w:pStyle w:val="ListBullet"/>
+        <w:spacing w:after="40"/>
+      </w:pPr>
+      <w:r>
+        <w:t xml:space="preserve">From a vendor: pay with money from wallets, or snatch it for free. Snatching makes the vendor shout and adds a little police heat.</w:t>
+      </w:r>
+    </w:p>
+    <w:p>
+      <w:pPr>
+        <w:pStyle w:val="ListBullet"/>
+        <w:spacing w:after="40"/>
+      </w:pPr>
+      <w:r>
+        <w:t xml:space="preserve">A vendor hands out one serving at a time and then needs a short while to make the next, so a cart is a hotspot worth fighting over, not a buffet.</w:t>
+      </w:r>
+    </w:p>
+    <w:p>
+      <w:r>
+        <w:t xml:space="preserve">Together the foods cover every kind of help a hunter or hunted bird needs. Bread is the only food that gives information, and only for 15 s, so chess pieces and gadgets stay the main way to track:</w:t>
+      </w:r>
+    </w:p>
+    <w:tbl>
+      <w:tblPr>
+        <w:tblStyle w:val="TableGrid"/>
+        <w:tblW w:type="auto" w:w="0"/>
+        <w:jc w:val="center"/>
+        <w:tblLook w:firstColumn="1" w:firstRow="1" w:lastColumn="0" w:lastRow="0" w:noHBand="0" w:noVBand="1" w:val="04A0"/>
+      </w:tblPr>
+      <w:tblGrid>
+        <w:gridCol w:w="3360"/>
+        <w:gridCol w:w="3360"/>
+        <w:gridCol w:w="3360"/>
+      </w:tblGrid>
+      <w:tr>
+        <w:tc>
+          <w:tcPr>
+            <w:tcW w:type="dxa" w:w="3360"/>
+            <w:shd w:fill="E2F0D9"/>
+          </w:tcPr>
+          <w:p>
+            <w:r/>
+            <w:r>
+              <w:rPr>
+                <w:b/>
+                <w:sz w:val="18"/>
+              </w:rPr>
+              <w:t xml:space="preserve">What a bird needs</w:t>
+            </w:r>
+          </w:p>
+        </w:tc>
+        <w:tc>
+          <w:tcPr>
+            <w:tcW w:type="dxa" w:w="3360"/>
+            <w:shd w:fill="E2F0D9"/>
+          </w:tcPr>
+          <w:p>
+            <w:r/>
+            <w:r>
+              <w:rPr>
+                <w:b/>
+                <w:sz w:val="18"/>
+              </w:rPr>
+              <w:t xml:space="preserve">Food that gives it</w:t>
+            </w:r>
+          </w:p>
+        </w:tc>
+        <w:tc>
+          <w:tcPr>
+            <w:tcW w:type="dxa" w:w="3360"/>
+            <w:shd w:fill="E2F0D9"/>
+          </w:tcPr>
+          <w:p>
+            <w:r/>
+            <w:r>
+              <w:rPr>
+                <w:b/>
+                <w:sz w:val="18"/>
+              </w:rPr>
+              <w:t xml:space="preserve">Not food: covered by</w:t>
+            </w:r>
+          </w:p>
+        </w:tc>
+      </w:tr>
+      <w:tr>
+        <w:tc>
+          <w:tcPr>
+            <w:tcW w:type="dxa" w:w="3360"/>
+          </w:tcPr>
+          <w:p>
+            <w:r/>
+            <w:r>
+              <w:rPr>
+                <w:b w:val="0"/>
+                <w:sz w:val="18"/>
+              </w:rPr>
+              <w:t xml:space="preserve">Close or open distance on the ground</w:t>
+            </w:r>
+          </w:p>
+        </w:tc>
+        <w:tc>
+          <w:tcPr>
+            <w:tcW w:type="dxa" w:w="3360"/>
+          </w:tcPr>
+          <w:p>
+            <w:r/>
+            <w:r>
+              <w:rPr>
+                <w:b w:val="0"/>
+                <w:sz w:val="18"/>
+              </w:rPr>
+              <w:t xml:space="preserve">Hot dog; pizza (on a ridden person)</w:t>
+            </w:r>
+          </w:p>
+        </w:tc>
+        <w:tc>
+          <w:tcPr>
+            <w:tcW w:type="dxa" w:w="3360"/>
+          </w:tcPr>
+          <w:p>
+            <w:r/>
+            <w:r>
+              <w:rPr>
+                <w:b w:val="0"/>
+                <w:sz w:val="18"/>
+              </w:rPr>
+              <w:t xml:space="preserve">Bikes, cars, skateboard</w:t>
+            </w:r>
+          </w:p>
+        </w:tc>
+      </w:tr>
+      <w:tr>
+        <w:tc>
+          <w:tcPr>
+            <w:tcW w:type="dxa" w:w="3360"/>
+          </w:tcPr>
+          <w:p>
+            <w:r/>
+            <w:r>
+              <w:rPr>
+                <w:b w:val="0"/>
+                <w:sz w:val="18"/>
+              </w:rPr>
+              <w:t xml:space="preserve">Height and air time</w:t>
+            </w:r>
+          </w:p>
+        </w:tc>
+        <w:tc>
+          <w:tcPr>
+            <w:tcW w:type="dxa" w:w="3360"/>
+          </w:tcPr>
+          <w:p>
+            <w:r/>
+            <w:r>
+              <w:rPr>
+                <w:b w:val="0"/>
+                <w:sz w:val="18"/>
+              </w:rPr>
+              <w:t xml:space="preserve">Coffee, ice cream</w:t>
+            </w:r>
+          </w:p>
+        </w:tc>
+        <w:tc>
+          <w:tcPr>
+            <w:tcW w:type="dxa" w:w="3360"/>
+          </w:tcPr>
+          <w:p>
+            <w:r/>
+            <w:r>
+              <w:rPr>
+                <w:b w:val="0"/>
+                <w:sz w:val="18"/>
+              </w:rPr>
+              <w:t xml:space="preserve">Human possession as a moving platform</w:t>
+            </w:r>
+          </w:p>
+        </w:tc>
+      </w:tr>
+      <w:tr>
+        <w:tc>
+          <w:tcPr>
+            <w:tcW w:type="dxa" w:w="3360"/>
+          </w:tcPr>
+          <w:p>
+            <w:r/>
+            <w:r>
+              <w:rPr>
+                <w:b w:val="0"/>
+                <w:sz w:val="18"/>
+              </w:rPr>
+              <w:t xml:space="preserve">A sudden lunge or juke</w:t>
+            </w:r>
+          </w:p>
+        </w:tc>
+        <w:tc>
+          <w:tcPr>
+            <w:tcW w:type="dxa" w:w="3360"/>
+          </w:tcPr>
+          <w:p>
+            <w:r/>
+            <w:r>
+              <w:rPr>
+                <w:b w:val="0"/>
+                <w:sz w:val="18"/>
+              </w:rPr>
+              <w:t xml:space="preserve">Burrito</w:t>
+            </w:r>
+          </w:p>
+        </w:tc>
+        <w:tc>
+          <w:tcPr>
+            <w:tcW w:type="dxa" w:w="3360"/>
+          </w:tcPr>
+          <w:p>
+            <w:r/>
+            <w:r>
+              <w:rPr>
+                <w:b w:val="0"/>
+                <w:sz w:val="18"/>
+              </w:rPr>
+              <w:t xml:space="preserve">—</w:t>
+            </w:r>
+          </w:p>
+        </w:tc>
+      </w:tr>
+      <w:tr>
+        <w:tc>
+          <w:tcPr>
+            <w:tcW w:type="dxa" w:w="3360"/>
+          </w:tcPr>
+          <w:p>
+            <w:r/>
+            <w:r>
+              <w:rPr>
+                <w:b w:val="0"/>
+                <w:sz w:val="18"/>
+              </w:rPr>
+              <w:t xml:space="preserve">Staying out of reach</w:t>
+            </w:r>
+          </w:p>
+        </w:tc>
+        <w:tc>
+          <w:tcPr>
+            <w:tcW w:type="dxa" w:w="3360"/>
+          </w:tcPr>
+          <w:p>
+            <w:r/>
+            <w:r>
+              <w:rPr>
+                <w:b w:val="0"/>
+                <w:sz w:val="18"/>
+              </w:rPr>
+              <w:t xml:space="preserve">Ice cream</w:t>
+            </w:r>
+          </w:p>
+        </w:tc>
+        <w:tc>
+          <w:tcPr>
+            <w:tcW w:type="dxa" w:w="3360"/>
+          </w:tcPr>
+          <w:p>
+            <w:r/>
+            <w:r>
+              <w:rPr>
+                <w:b w:val="0"/>
+                <w:sz w:val="18"/>
+              </w:rPr>
+              <w:t xml:space="preserve">Arch and rooftops</w:t>
+            </w:r>
+          </w:p>
+        </w:tc>
+      </w:tr>
+      <w:tr>
+        <w:tc>
+          <w:tcPr>
+            <w:tcW w:type="dxa" w:w="3360"/>
+          </w:tcPr>
+          <w:p>
+            <w:r/>
+            <w:r>
+              <w:rPr>
+                <w:b w:val="0"/>
+                <w:sz w:val="18"/>
+              </w:rPr>
+              <w:t xml:space="preserve">Lasting longer</w:t>
+            </w:r>
+          </w:p>
+        </w:tc>
+        <w:tc>
+          <w:tcPr>
+            <w:tcW w:type="dxa" w:w="3360"/>
+          </w:tcPr>
+          <w:p>
+            <w:r/>
+            <w:r>
+              <w:rPr>
+                <w:b w:val="0"/>
+                <w:sz w:val="18"/>
+              </w:rPr>
+              <w:t xml:space="preserve">Gyro wrap, bagel</w:t>
+            </w:r>
+          </w:p>
+        </w:tc>
+        <w:tc>
+          <w:tcPr>
+            <w:tcW w:type="dxa" w:w="3360"/>
+          </w:tcPr>
+          <w:p>
+            <w:r/>
+            <w:r>
+              <w:rPr>
+                <w:b w:val="0"/>
+                <w:sz w:val="18"/>
+              </w:rPr>
+              <w:t xml:space="preserve">Trash-can lid</w:t>
+            </w:r>
+          </w:p>
+        </w:tc>
+      </w:tr>
+      <w:tr>
+        <w:tc>
+          <w:tcPr>
+            <w:tcW w:type="dxa" w:w="3360"/>
+          </w:tcPr>
+          <w:p>
+            <w:r/>
+            <w:r>
+              <w:rPr>
+                <w:b w:val="0"/>
+                <w:sz w:val="18"/>
+              </w:rPr>
+              <w:t xml:space="preserve">Controlling ground</w:t>
+            </w:r>
+          </w:p>
+        </w:tc>
+        <w:tc>
+          <w:tcPr>
+            <w:tcW w:type="dxa" w:w="3360"/>
+          </w:tcPr>
+          <w:p>
+            <w:r/>
+            <w:r>
+              <w:rPr>
+                <w:b w:val="0"/>
+                <w:sz w:val="18"/>
+              </w:rPr>
+              <w:t xml:space="preserve">Ice cream</w:t>
+            </w:r>
+          </w:p>
+        </w:tc>
+        <w:tc>
+          <w:tcPr>
+            <w:tcW w:type="dxa" w:w="3360"/>
+          </w:tcPr>
+          <w:p>
+            <w:r/>
+            <w:r>
+              <w:rPr>
+                <w:b w:val="0"/>
+                <w:sz w:val="18"/>
+              </w:rPr>
+              <w:t xml:space="preserve">Dog ball, whistle</w:t>
+            </w:r>
+          </w:p>
+        </w:tc>
+      </w:tr>
+      <w:tr>
+        <w:tc>
+          <w:tcPr>
+            <w:tcW w:type="dxa" w:w="3360"/>
+          </w:tcPr>
+          <w:p>
+            <w:r/>
+            <w:r>
+              <w:rPr>
+                <w:b w:val="0"/>
+                <w:sz w:val="18"/>
+              </w:rPr>
+              <w:t xml:space="preserve">Breaking line of sight</w:t>
+            </w:r>
+          </w:p>
+        </w:tc>
+        <w:tc>
+          <w:tcPr>
+            <w:tcW w:type="dxa" w:w="3360"/>
+          </w:tcPr>
+          <w:p>
+            <w:r/>
+            <w:r>
+              <w:rPr>
+                <w:b w:val="0"/>
+                <w:sz w:val="18"/>
+              </w:rPr>
+              <w:t xml:space="preserve">—</w:t>
+            </w:r>
+          </w:p>
+        </w:tc>
+        <w:tc>
+          <w:tcPr>
+            <w:tcW w:type="dxa" w:w="3360"/>
+          </w:tcPr>
+          <w:p>
+            <w:r/>
+            <w:r>
+              <w:rPr>
+                <w:b w:val="0"/>
+                <w:sz w:val="18"/>
+              </w:rPr>
+              <w:t xml:space="preserve">Crowds, flocks, buildings</w:t>
+            </w:r>
+          </w:p>
+        </w:tc>
+      </w:tr>
+      <w:tr>
+        <w:tc>
+          <w:tcPr>
+            <w:tcW w:type="dxa" w:w="3360"/>
+          </w:tcPr>
+          <w:p>
+            <w:r/>
+            <w:r>
+              <w:rPr>
+                <w:b w:val="0"/>
+                <w:sz w:val="18"/>
+              </w:rPr>
+              <w:t xml:space="preserve">Using people</w:t>
+            </w:r>
+          </w:p>
+        </w:tc>
+        <w:tc>
+          <w:tcPr>
+            <w:tcW w:type="dxa" w:w="3360"/>
+          </w:tcPr>
+          <w:p>
+            <w:r/>
+            <w:r>
+              <w:rPr>
+                <w:b w:val="0"/>
+                <w:sz w:val="18"/>
+              </w:rPr>
+              <w:t xml:space="preserve">Pizza; pretzel (people ignore your shots)</w:t>
+            </w:r>
+          </w:p>
+        </w:tc>
+        <w:tc>
+          <w:tcPr>
+            <w:tcW w:type="dxa" w:w="3360"/>
+          </w:tcPr>
+          <w:p>
+            <w:r/>
+            <w:r>
+              <w:rPr>
+                <w:b w:val="0"/>
+                <w:sz w:val="18"/>
+              </w:rPr>
+              <w:t xml:space="preserve">Human possession itself</w:t>
+            </w:r>
+          </w:p>
+        </w:tc>
+      </w:tr>
+      <w:tr>
+        <w:tc>
+          <w:tcPr>
+            <w:tcW w:type="dxa" w:w="3360"/>
+          </w:tcPr>
+          <w:p>
+            <w:r/>
+            <w:r>
+              <w:rPr>
+                <w:b w:val="0"/>
+                <w:sz w:val="18"/>
+              </w:rPr>
+              <w:t xml:space="preserve">Finding the other bird, or hiding from it</w:t>
+            </w:r>
+          </w:p>
+        </w:tc>
+        <w:tc>
+          <w:tcPr>
+            <w:tcW w:type="dxa" w:w="3360"/>
+          </w:tcPr>
+          <w:p>
+            <w:r/>
+            <w:r>
+              <w:rPr>
+                <w:b w:val="0"/>
+                <w:sz w:val="18"/>
+              </w:rPr>
+              <w:t xml:space="preserve">Bread (finding only, 15 s)</w:t>
+            </w:r>
+          </w:p>
+        </w:tc>
+        <w:tc>
+          <w:tcPr>
+            <w:tcW w:type="dxa" w:w="3360"/>
+          </w:tcPr>
+          <w:p>
+            <w:r/>
+            <w:r>
+              <w:rPr>
+                <w:b w:val="0"/>
+                <w:sz w:val="18"/>
+              </w:rPr>
+              <w:t xml:space="preserve">Chess pieces, phone, sunglasses</w:t>
+            </w:r>
+          </w:p>
+        </w:tc>
+      </w:tr>
+    </w:tbl>
+    <w:p>
+      <w:pPr>
         <w:pStyle w:val="Heading1"/>
       </w:pPr>
       <w:r>
@@ -2748,6 +3777,15 @@
       </w:pPr>
       <w:r>
         <w:t>Examples: a person sets down coffee, a chess game begins, somebody drops food, a vendor creates a temporary resource hotspot, or a street performer introduces an unusual prop.</w:t>
+      </w:r>
+    </w:p>
+    <w:p>
+      <w:pPr>
+        <w:pStyle w:val="ListBullet"/>
+        <w:spacing w:after="40"/>
+      </w:pPr>
+      <w:r>
+        <w:t xml:space="preserve">Food carts and trucks are standing hotspots: each always serves the same menu (section 10, Food), but only one serving at a time, so which vendor to visit, and when, is a live decision.</w:t>
       </w:r>
     </w:p>
     <w:p>
@@ -3237,7 +4275,7 @@
     </w:p>
     <w:p>
       <w:r>
-        <w:t>The Pigeon spots the Seagull near the chess tables. The Seagull eats food for a burst of speed and chains three jumps through benches and pedestrians. The Pigeon steals a chess piece to sharpen its minimap information, lands on a jogger's head, and uses the jogger to close distance. The Seagull throws bread, creating a flock that breaks line of sight, then jumps onto a cyclist. The Pigeon fires at a nearby vehicle to force its driver out, steals the car, clips a civilian, and gains police heat. The Seagull doubles back through a narrow path the car cannot follow. Police interfere with the Pigeon; the Pigeon crashes and dies. The Pigeon respawns with Status reset while the same 3:00 clock continues to tick down.</w:t>
+        <w:t>The Pigeon spots the Seagull near the chess tables. The Seagull eats food for a burst of speed and chains three jumps through benches and pedestrians. The Pigeon steals a chess piece to sharpen its minimap information, lands on a jogger's head, and uses the jogger to close distance. The Seagull sets off an egg bomb, shoots straight up out of reach, and comes down onto a cyclist. The Pigeon fires at a nearby vehicle to force its driver out, steals the car, clips a civilian, and gains police heat. The Seagull doubles back through a narrow path the car cannot follow. Police interfere with the Pigeon; the Pigeon crashes and dies. The Pigeon respawns with Status reset while the same 3:00 clock continues to tick down.</w:t>
       </w:r>
     </w:p>
     <w:p>
@@ -3438,7 +4476,7 @@
         <w:spacing w:after="40"/>
       </w:pPr>
       <w:r>
-        <w:t>Three representative items: food (movement), chess piece (information), bread (chaos).</w:t>
+        <w:t>Three representative items: hot dog (movement), chess piece (information), bread (chaos).</w:t>
       </w:r>
     </w:p>
     <w:p>
@@ -3546,6 +4584,15 @@
         <w:spacing w:after="40"/>
       </w:pPr>
       <w:r>
+        <w:t xml:space="preserve">Food prices, how much police heat snatching from a vendor should cost, and how long a vendor takes to make the next serving.</w:t>
+      </w:r>
+    </w:p>
+    <w:p>
+      <w:pPr>
+        <w:pStyle w:val="ListBullet"/>
+        <w:spacing w:after="40"/>
+      </w:pPr>
+      <w:r>
         <w:t>How much police heat resets versus merely decays after Pigeon death.</w:t>
       </w:r>
     </w:p>
@@ -3581,6 +4628,177 @@
           <w:b/>
         </w:rPr>
         <w:t>A two-player, round-based game of tag in Washington Square Park where a gun-toting Pigeon hunts a Seagull that has to finish a list of park mischief before time runs out, and both players weaponize food, chess, pedestrians, vehicles, police, and the park itself before swapping roles.</w:t>
+      </w:r>
+    </w:p>
+    <w:p>
+      <w:pPr>
+        <w:pStyle w:val="Heading1"/>
+      </w:pPr>
+      <w:r>
+        <w:t>21. Current Build</w:t>
+      </w:r>
+    </w:p>
+    <w:p>
+      <w:r>
+        <w:t xml:space="preserve">What the playable prototype has now, and which part of the design above each piece serves. Numbers are current tuning values, not final balance.</w:t>
+      </w:r>
+    </w:p>
+    <w:p>
+      <w:pPr>
+        <w:pStyle w:val="Heading2"/>
+      </w:pPr>
+      <w:r>
+        <w:t>Food Carts and Trucks (sections 5, 11, 14)</w:t>
+      </w:r>
+    </w:p>
+    <w:p>
+      <w:pPr>
+        <w:pStyle w:val="ListBullet"/>
+        <w:spacing w:after="40"/>
+      </w:pPr>
+      <w:r>
+        <w:t xml:space="preserve">Nine carts stand on the park paths (halal, coffee and hot dog, three of each), with their backs to the path edge so the path stays walkable.</w:t>
+      </w:r>
+    </w:p>
+    <w:p>
+      <w:pPr>
+        <w:pStyle w:val="ListBullet"/>
+        <w:spacing w:after="40"/>
+      </w:pPr>
+      <w:r>
+        <w:t xml:space="preserve">Six food trucks (Mexican and ice cream, three of each) are parked on the surrounding streets against the park-side curb, serving hatch facing the park.</w:t>
+      </w:r>
+    </w:p>
+    <w:p>
+      <w:pPr>
+        <w:pStyle w:val="ListBullet"/>
+        <w:spacing w:after="40"/>
+      </w:pPr>
+      <w:r>
+        <w:t xml:space="preserve">Every cart and truck is a yellow square on the Pigeon's minimap.</w:t>
+      </w:r>
+    </w:p>
+    <w:p>
+      <w:pPr>
+        <w:pStyle w:val="ListBullet"/>
+        <w:spacing w:after="40"/>
+      </w:pPr>
+      <w:r>
+        <w:t xml:space="preserve">Landing on top of a cart umbrella bounces the bird about 12 m into the air, a high launch point for the three-jump system. With no steering it keeps bouncing like a trampoline. This is separate from the carried Umbrella item in section 10.</w:t>
+      </w:r>
+    </w:p>
+    <w:p>
+      <w:pPr>
+        <w:pStyle w:val="ListBullet"/>
+        <w:spacing w:after="40"/>
+      </w:pPr>
+      <w:r>
+        <w:t xml:space="preserve">Every vendor has its food on the counter: gyros at the halal carts, coffee at the coffee carts, hot dogs and soft pretzels at the hot dog carts, burritos at the Mexican trucks and ice cream at the ice cream trucks. Pizza slices sit on some chess tables, and bagels and bread on some benches. Look at one up close and an E prompt names the food and its ability; pressing E eats it. A timed ability runs with a countdown at the top of the screen; a stashed food shows there with its count (F sets off an egg bomb, G sends a snitch flock). The serving comes back 30 s later (45 s in the park). All nine abilities from section 10 work as written, except that the ability does not show on the bird. Food from a cart or truck is bought with wallet money: look at the vendor (or at one serving on its counter, to choose at a hot dog cart) and press E; the prompt shows the price, or how much you have if it is not enough. Prices for now: coffee $3, hot dog and soft pretzel $4, ice cream $6, burrito $9, gyro $10. Pizza, bagels and bread found around the park stay free. Snatching without paying is not built yet. The hot dog has our own model; every other food has a free placeholder model (see Park_Food_Model_List.docx).</w:t>
+      </w:r>
+    </w:p>
+    <w:p>
+      <w:pPr>
+        <w:pStyle w:val="Heading2"/>
+      </w:pPr>
+      <w:r>
+        <w:t>Chess Tables (sections 8, 10, 14)</w:t>
+      </w:r>
+    </w:p>
+    <w:p>
+      <w:pPr>
+        <w:pStyle w:val="ListBullet"/>
+        <w:spacing w:after="40"/>
+      </w:pPr>
+      <w:r>
+        <w:t xml:space="preserve">26 chess tables, each with a board and a full set of 32 pieces.</w:t>
+      </w:r>
+    </w:p>
+    <w:p>
+      <w:pPr>
+        <w:pStyle w:val="ListBullet"/>
+        <w:spacing w:after="40"/>
+      </w:pPr>
+      <w:r>
+        <w:t xml:space="preserve">The Pigeon aims at a piece within 1.5 m: the piece glows gold and an “E: Eat” prompt appears. Eating it removes the piece and, for 10 seconds, swaps the minimap's approximate circle for the Seagull's exact position and outlines the Seagull in red through walls.</w:t>
+      </w:r>
+    </w:p>
+    <w:p>
+      <w:pPr>
+        <w:pStyle w:val="ListBullet"/>
+        <w:spacing w:after="40"/>
+      </w:pPr>
+      <w:r>
+        <w:t xml:space="preserve">Every piece currently gives this same full reveal; the separate king and queen strengths from section 10 are not split out yet, and there is no cooldown.</w:t>
+      </w:r>
+    </w:p>
+    <w:p>
+      <w:pPr>
+        <w:pStyle w:val="ListBullet"/>
+        <w:spacing w:after="40"/>
+      </w:pPr>
+      <w:r>
+        <w:t xml:space="preserve">Park NPCs walk to free tables in pairs, sit down across from each other and talk, so the tables look occupied.</w:t>
+      </w:r>
+    </w:p>
+    <w:p>
+      <w:pPr>
+        <w:pStyle w:val="Heading2"/>
+      </w:pPr>
+      <w:r>
+        <w:t>Drops and Money (sections 11, 12)</w:t>
+      </w:r>
+    </w:p>
+    <w:p>
+      <w:pPr>
+        <w:pStyle w:val="ListBullet"/>
+        <w:spacing w:after="40"/>
+      </w:pPr>
+      <w:r>
+        <w:t xml:space="preserve">A civilian who dies drops a wallet holding a random $5 to $100; an officer who dies drops a magazine worth one extra reload.</w:t>
+      </w:r>
+    </w:p>
+    <w:p>
+      <w:pPr>
+        <w:pStyle w:val="ListBullet"/>
+        <w:spacing w:after="40"/>
+      </w:pPr>
+      <w:r>
+        <w:t xml:space="preserve">Drops float and spin where the person fell and fly to the Pigeon once it is within 4 m.</w:t>
+      </w:r>
+    </w:p>
+    <w:p>
+      <w:pPr>
+        <w:pStyle w:val="ListBullet"/>
+        <w:spacing w:after="40"/>
+      </w:pPr>
+      <w:r>
+        <w:t xml:space="preserve">Money is shown on the HUD but has no use yet. What it buys is an open question.</w:t>
+      </w:r>
+    </w:p>
+    <w:p>
+      <w:pPr>
+        <w:pStyle w:val="Heading2"/>
+      </w:pPr>
+      <w:r>
+        <w:t>Pigeon Death (section 13)</w:t>
+      </w:r>
+    </w:p>
+    <w:p>
+      <w:pPr>
+        <w:pStyle w:val="ListBullet"/>
+        <w:spacing w:after="40"/>
+      </w:pPr>
+      <w:r>
+        <w:t xml:space="preserve">On death the Pigeon ragdolls and its gun comes loose and falls to the ground under physics, so the death reads clearly to both players.</w:t>
+      </w:r>
+    </w:p>
+    <w:p>
+      <w:pPr>
+        <w:pStyle w:val="ListBullet"/>
+        <w:spacing w:after="40"/>
+      </w:pPr>
+      <w:r>
+        <w:t xml:space="preserve">The scene restarts 3 seconds later. This stands in for the respawn: the running round timer and the Status reset are not built yet.</w:t>
       </w:r>
     </w:p>
     <w:sectPr>

</xml_diff>

<commit_message>
visuals look better now
</commit_message>
<xml_diff>
--- a/Assets/Pigeon_vs_Seagull_Game_Design_Document.docx
+++ b/Assets/Pigeon_vs_Seagull_Game_Design_Document.docx
@@ -4693,7 +4693,7 @@
         <w:spacing w:after="40"/>
       </w:pPr>
       <w:r>
-        <w:t xml:space="preserve">Every vendor has its food on the counter: gyros at the halal carts, coffee at the coffee carts, hot dogs and soft pretzels at the hot dog carts, burritos at the Mexican trucks and ice cream at the ice cream trucks. Pizza slices sit on some chess tables, and bagels and bread on some benches. Look at one up close and an E prompt names the food and its ability; pressing E eats it. A timed ability runs with a countdown at the top of the screen; a stashed food shows there with its count (F sets off an egg bomb, G sends a snitch flock). The serving comes back 30 s later (45 s in the park). All nine abilities from section 10 work as written, except that the ability does not show on the bird. Food from a cart or truck is bought with wallet money: look at the vendor (or at one serving on its counter, to choose at a hot dog cart) and press E; the prompt shows the price, or how much you have if it is not enough. Prices for now: coffee $3, hot dog and soft pretzel $4, ice cream $6, burrito $9, gyro $10. Pizza, bagels and bread found around the park stay free. Snatching without paying is not built yet. The hot dog has our own model; every other food has a free placeholder model (see Park_Food_Model_List.docx).</w:t>
+        <w:t xml:space="preserve">Every vendor has its food on the counter: gyros at the halal carts, coffee at the coffee carts, hot dogs and soft pretzels at the hot dog carts, burritos at the Mexican trucks and ice cream at the ice cream trucks. Pizza slices sit on some chess tables, and bagels and bread on some benches. Look at one up close and an E prompt names the food and its ability; pressing E eats it. A timed ability runs with a countdown at the top of the screen; a stashed food shows there with its count (F sets off an egg bomb, G sends a snitch flock). The serving comes back 30 s later (45 s in the park). All nine abilities from section 10 work as written, except that the ability does not show on the bird. Eating any food also heals 15 health (of 30), never past full. Food from a cart or truck is bought with wallet money: look at the vendor (or at one serving on its counter, to choose at a hot dog cart) and press E; the prompt shows the price, or how much you have if it is not enough. Prices for now: coffee $3, hot dog and soft pretzel $4, ice cream $6, burrito $9, gyro $10. Pizza, bagels and bread found around the park stay free. Snatching without paying is not built yet. The hot dog has our own model; every other food has a free placeholder model (see Park_Food_Model_List.docx).</w:t>
       </w:r>
     </w:p>
     <w:p>
@@ -4763,6 +4763,15 @@
         <w:spacing w:after="40"/>
       </w:pPr>
       <w:r>
+        <w:t xml:space="preserve">Anyone who dies also has a 30% chance of dropping a random food beside the body. It is free and does not come back once eaten. (Written, not yet tested in play.)</w:t>
+      </w:r>
+    </w:p>
+    <w:p>
+      <w:pPr>
+        <w:pStyle w:val="ListBullet"/>
+        <w:spacing w:after="40"/>
+      </w:pPr>
+      <w:r>
         <w:t xml:space="preserve">Drops float and spin where the person fell and fly to the Pigeon once it is within 4 m.</w:t>
       </w:r>
     </w:p>
@@ -4772,7 +4781,7 @@
         <w:spacing w:after="40"/>
       </w:pPr>
       <w:r>
-        <w:t xml:space="preserve">Money is shown on the HUD but has no use yet. What it buys is an open question.</w:t>
+        <w:t xml:space="preserve">Money buys food at the carts and trucks (see Food Carts and Trucks above). The bird starts the scene with Starting Money on its Weapon component, $0 for now; money is kept through an online respawn.</w:t>
       </w:r>
     </w:p>
     <w:p>
@@ -4798,7 +4807,431 @@
         <w:spacing w:after="40"/>
       </w:pPr>
       <w:r>
-        <w:t xml:space="preserve">The scene restarts 3 seconds later. This stands in for the respawn: the running round timer and the Status reset are not built yet.</w:t>
+        <w:t xml:space="preserve">Online, the Pigeon respawns at its spawn point 3 seconds later with its gun re-armed and all food powers cleared (the stand-in for the Status reset); the round clock keeps running. Offline, in the test scenes, the scene still restarts 3 seconds later.</w:t>
+      </w:r>
+    </w:p>
+    <w:p>
+      <w:pPr>
+        <w:pStyle w:val="Heading2"/>
+      </w:pPr>
+      <w:r>
+        <w:t>Online Match (sections 3, 4, 13)</w:t>
+      </w:r>
+    </w:p>
+    <w:p>
+      <w:pPr>
+        <w:pStyle w:val="ListBullet"/>
+        <w:spacing w:after="40"/>
+      </w:pPr>
+      <w:r>
+        <w:t xml:space="preserve">Two players connect through Unity Relay, so no open ports are needed: one hosts and gets a join code, the other types it in.</w:t>
+      </w:r>
+    </w:p>
+    <w:p>
+      <w:pPr>
+        <w:pStyle w:val="ListBullet"/>
+        <w:spacing w:after="40"/>
+      </w:pPr>
+      <w:r>
+        <w:t xml:space="preserve">Two rounds of 3:00 with a 5 second breather before each. The host is the Pigeon in round 1; roles swap for round 2.</w:t>
+      </w:r>
+    </w:p>
+    <w:p>
+      <w:pPr>
+        <w:pStyle w:val="ListBullet"/>
+        <w:spacing w:after="40"/>
+      </w:pPr>
+      <w:r>
+        <w:t xml:space="preserve">A round ends when the Seagull dies (a kill, timed) or at 0:00. At 0:00 the Seagull wins the round only if every task is done; a Seagull with any task unfinished at 0:00 loses the whole match outright, whatever happened in the other round (if both players fail as Seagull it is a draw). Otherwise the faster kill as Pigeon wins the match.</w:t>
+      </w:r>
+    </w:p>
+    <w:p>
+      <w:pPr>
+        <w:pStyle w:val="ListBullet"/>
+        <w:spacing w:after="40"/>
+      </w:pPr>
+      <w:r>
+        <w:t xml:space="preserve">Both birds have the same kit: the gun, all food powers and riding people. The Seagull shooting the Pigeon does not end the round, it only buys time.</w:t>
+      </w:r>
+    </w:p>
+    <w:p>
+      <w:pPr>
+        <w:pStyle w:val="ListBullet"/>
+        <w:spacing w:after="40"/>
+      </w:pPr>
+      <w:r>
+        <w:t xml:space="preserve">For testing, Unity Multiplayer Play Mode (Window &gt; Multiplayer &gt; Multiplayer Play Mode) opens a second player inside the editor.</w:t>
+      </w:r>
+    </w:p>
+    <w:p>
+      <w:pPr>
+        <w:pStyle w:val="ListBullet"/>
+        <w:spacing w:after="40"/>
+      </w:pPr>
+      <w:r>
+        <w:t xml:space="preserve">The birds’ one-off animations (shooting, eating, a silent kill) play on both games, on the bird each player sees. (Written, not yet tested in play.)</w:t>
+      </w:r>
+    </w:p>
+    <w:p>
+      <w:pPr>
+        <w:pStyle w:val="ListBullet"/>
+        <w:spacing w:after="40"/>
+      </w:pPr>
+      <w:r>
+        <w:t xml:space="preserve">Starting menu: Host a match, Join with a code, or Play offline. While it is open the bird takes no input at all, so clicking its buttons does not shoot, scope or move the bird, and the cursor stays free.</w:t>
+      </w:r>
+    </w:p>
+    <w:p>
+      <w:pPr>
+        <w:pStyle w:val="ListBullet"/>
+        <w:spacing w:after="40"/>
+      </w:pPr>
+      <w:r>
+        <w:t xml:space="preserve">Escape menu (Esc during play, in the same style): Resume, Quit to menu (leaves the online match and starts the scene over at the starting menu) and Quit game; it shows the join code when online. Offline it pauses the game; online the game keeps running, and the bird just takes no input while it is open. Leaving an online match drops the other player without telling them yet. (Written, not yet tested in play.)</w:t>
+      </w:r>
+    </w:p>
+    <w:p>
+      <w:pPr>
+        <w:pStyle w:val="Heading2"/>
+      </w:pPr>
+      <w:r>
+        <w:t>Seagull Tasks (section 4)</w:t>
+      </w:r>
+    </w:p>
+    <w:p>
+      <w:pPr>
+        <w:pStyle w:val="ListBullet"/>
+        <w:spacing w:after="40"/>
+      </w:pPr>
+      <w:r>
+        <w:t xml:space="preserve">The three prototype tasks from section 18 are in: take a bath in the fountain (5 s), stand on a chess table (3 s), and perch on top of the arch (3 s).</w:t>
+      </w:r>
+    </w:p>
+    <w:p>
+      <w:pPr>
+        <w:pStyle w:val="ListBullet"/>
+        <w:spacing w:after="40"/>
+      </w:pPr>
+      <w:r>
+        <w:t xml:space="preserve">A task completes by staying inside its area for the whole time in one go; leaving resets it. Tasks can be done in any order.</w:t>
+      </w:r>
+    </w:p>
+    <w:p>
+      <w:pPr>
+        <w:pStyle w:val="ListBullet"/>
+        <w:spacing w:after="40"/>
+      </w:pPr>
+      <w:r>
+        <w:t xml:space="preserve">Each finished task shows the Pigeon the Seagull’s exact position on its minimap for 3 seconds.</w:t>
+      </w:r>
+    </w:p>
+    <w:p>
+      <w:pPr>
+        <w:pStyle w:val="ListBullet"/>
+        <w:spacing w:after="40"/>
+      </w:pPr>
+      <w:r>
+        <w:t xml:space="preserve">The Pigeon knows the Seagull’s tasks: its panel lists the same tasks, ticked off as they are finished, with how many are left. Both minimaps show a blue diamond on each unfinished task spot, gone once it is done, so the Pigeon can lie in wait. (Written, not yet tested in play.)</w:t>
+      </w:r>
+    </w:p>
+    <w:p>
+      <w:pPr>
+        <w:pStyle w:val="ListBullet"/>
+        <w:spacing w:after="40"/>
+      </w:pPr>
+      <w:r>
+        <w:t xml:space="preserve">Each round the Seagull gets 3 tasks drawn from a pool of about 175 (both games draw the same ones). The pool is an editable list: Tools &gt; Wash Square &gt; Hunt Tasks (Assets/Resources/HuntTasks.asset), with Per Round setting how many are drawn. The scene’s own fountain, arch and chess table tasks are drawn along with them. A task whose place or vehicle is not in the scene is never drawn there.</w:t>
+      </w:r>
+    </w:p>
+    <w:p>
+      <w:pPr>
+        <w:pStyle w:val="ListBullet"/>
+        <w:spacing w:after="40"/>
+      </w:pPr>
+      <w:r>
+        <w:t xml:space="preserve">Every task has a Goal that says how it is done: Stay (be at a place, or on top of it, for some seconds; optionally at several different ones), StandOn (stand on a named ground such as the lawn, sandpit, dog run or road), Deed (do something a number of times), RidePerson (seconds riding people), DriveCar and RideBike (metres), Airborne (seconds in the air), Altitude (metres above whatever is below), Wanted (seconds survived while wanted), Survive (seconds alive), Money (dollars held at once), Earn and Spend (dollars in all), Stock (food powers held, e.g. 4 egg bombs) and Reloads (spare magazines held). Seconds can be in one go or add up. Any task can also require a condition at the same time (flying, on foot, riding someone, driving, wanted, badly hurt, or hidden), and a deed can be limited to a place (kill from a rooftop, the arch, a lamp post, the fountain, a chess table or bench) or to a time window (3 kills within 15 s).</w:t>
+      </w:r>
+    </w:p>
+    <w:p>
+      <w:pPr>
+        <w:pStyle w:val="ListBullet"/>
+        <w:spacing w:after="40"/>
+      </w:pPr>
+      <w:r>
+        <w:t xml:space="preserve">Deeds the game counts: shoot, reload, hit, body shot, headshot, hit civilian/officer/guard/bird, kill, kill civilian/officer/guard/walker/jogger/idler, shot kill, headshot kill, long shot kill (40 m+), point blank kill (3 m or less), double kill, triple kill, roadkill, egg kill, silent kill, run over (and by kind), run over bird (park birds), crash (knock over a vehicle), assassinate (and by kind), egg bomb, egg hit (and by kind), snitch flock, eat, eat &lt;each food&gt;, eat chess piece, buy, wallet, magazine, ride person, ride civilian/officer/guard, drive car, ride bike, hijack (take over a moving car), wanted.</w:t>
+      </w:r>
+    </w:p>
+    <w:p>
+      <w:pPr>
+        <w:pStyle w:val="ListBullet"/>
+        <w:spacing w:after="40"/>
+      </w:pPr>
+      <w:r>
+        <w:t xml:space="preserve">The default pool covers perches (lamp posts, benches, chess tables, statues, the flagpole, the stage, play structures, cart and truck roofs, bike docks, the fence, the NYU buildings’ roofs round the park), grounds, each food, buying, loot, kills of each kind, headshots, silent kills, egg bombs, riding, driving, hijacking, running people over, being wanted, shooting the Pigeon, flying time and height, and the gun. The Seagull’s panel shows progress (counts, seconds left, metres); the Pigeon sees the same list with ticks. (Written, not yet tested in play.)</w:t>
+      </w:r>
+    </w:p>
+    <w:p>
+      <w:pPr>
+        <w:pStyle w:val="Heading2"/>
+      </w:pPr>
+      <w:r>
+        <w:t>Tracking and Damage Feedback (section 8)</w:t>
+      </w:r>
+    </w:p>
+    <w:p>
+      <w:pPr>
+        <w:pStyle w:val="ListBullet"/>
+        <w:spacing w:after="40"/>
+      </w:pPr>
+      <w:r>
+        <w:t xml:space="preserve">Each bird sees only a rough 25 m circle on its minimap for where the other bird is. Neither bird is outlined for the other. This is a change from the design, which gives the Seagull better information; it is now even on both sides.</w:t>
+      </w:r>
+    </w:p>
+    <w:p>
+      <w:pPr>
+        <w:pStyle w:val="ListBullet"/>
+        <w:spacing w:after="40"/>
+      </w:pPr>
+      <w:r>
+        <w:t xml:space="preserve">When that circle is off the edge of the minimap, a red arrow on the map’s edge points toward it.</w:t>
+      </w:r>
+    </w:p>
+    <w:p>
+      <w:pPr>
+        <w:pStyle w:val="ListBullet"/>
+        <w:spacing w:after="40"/>
+      </w:pPr>
+      <w:r>
+        <w:t xml:space="preserve">Taking damage flashes a red vignette around the screen, and a red arrow around the middle of the screen points to where the hit came from.</w:t>
+      </w:r>
+    </w:p>
+    <w:p>
+      <w:pPr>
+        <w:pStyle w:val="ListBullet"/>
+        <w:spacing w:after="40"/>
+      </w:pPr>
+      <w:r>
+        <w:t xml:space="preserve">Headshots: a shot whose line of fire goes through the head does 3 times the damage, for people (their head bone) and both birds (theirs). The gun does 10, so a headshot kills a civilian (30 health) outright and takes 30 off a bird (100). Police shots count headshots too. Every hit shows a hitmarker, a small X round the crosshair: white for a body shot, red for a headshot, which also flashes “HEADSHOT” over the crosshair. (Written, not yet tested in play.)</w:t>
+      </w:r>
+    </w:p>
+    <w:p>
+      <w:pPr>
+        <w:pStyle w:val="Heading2"/>
+      </w:pPr>
+      <w:r>
+        <w:t>Egg Bomb (section 10)</w:t>
+      </w:r>
+    </w:p>
+    <w:p>
+      <w:pPr>
+        <w:pStyle w:val="ListBullet"/>
+        <w:spacing w:after="40"/>
+      </w:pPr>
+      <w:r>
+        <w:t xml:space="preserve">Setting off the egg bomb throws the bird upward and fires a spotted egg straight down out of its rear; the blast happens where the egg lands and does 15 damage to anyone in range.</w:t>
+      </w:r>
+    </w:p>
+    <w:p>
+      <w:pPr>
+        <w:pStyle w:val="Heading2"/>
+      </w:pPr>
+      <w:r>
+        <w:t>Vehicles (sections 7, 12)</w:t>
+      </w:r>
+    </w:p>
+    <w:p>
+      <w:pPr>
+        <w:pStyle w:val="ListBullet"/>
+        <w:spacing w:after="40"/>
+      </w:pPr>
+      <w:r>
+        <w:t xml:space="preserve">Citi Bikes and six cars (NYC taxi, compact and midsize sedan, compact and large SUV, minivan) built from our own Blender models. Bikes also stand in Citi Bike docking stations.</w:t>
+      </w:r>
+    </w:p>
+    <w:p>
+      <w:pPr>
+        <w:pStyle w:val="ListBullet"/>
+        <w:spacing w:after="40"/>
+      </w:pPr>
+      <w:r>
+        <w:t xml:space="preserve">Land on the saddle or the roof to drive; the dismount key gets off. W drives, S brakes and then backs up, A and D steer, sprint goes faster; the camera looks around freely without turning the vehicle. Bike 6 m/s (9 sprinting), car 12 m/s (20). Jump hops a bike. Wheels roll, bike cranks turn and the bike leans into turns.</w:t>
+      </w:r>
+    </w:p>
+    <w:p>
+      <w:pPr>
+        <w:pStyle w:val="ListBullet"/>
+        <w:spacing w:after="40"/>
+      </w:pPr>
+      <w:r>
+        <w:t xml:space="preserve">No shooting while driving; the egg bomb and snitch flock still work.</w:t>
+      </w:r>
+    </w:p>
+    <w:p>
+      <w:pPr>
+        <w:pStyle w:val="ListBullet"/>
+        <w:spacing w:after="40"/>
+      </w:pPr>
+      <w:r>
+        <w:t xml:space="preserve">Running into people knocks them over as a ragdoll and does a little damage: a car any time it touches someone moving, 10 damage; a bike above 2 m/s, 5 damage. They get back up 3 s later unless it killed them. Police within 40 m of the hit go after the driver. On the Wash Square map, driving a car off the road (onto the pavement or into the park) makes the driver wanted: every officer on the map comes after them, and keeps hunting them, even out of sight, until 30 s after they were last off the road. A pulsing “WANTED 0:24” countdown shows in the top-left corner. It ends early if the driver dies or eats a soft pretzel (Low profile). Someone being ridden by a bird stops a vehicle like a wall.</w:t>
+      </w:r>
+    </w:p>
+    <w:p>
+      <w:pPr>
+        <w:pStyle w:val="ListBullet"/>
+        <w:spacing w:after="40"/>
+      </w:pPr>
+      <w:r>
+        <w:t xml:space="preserve">Silent kill: on someone’s head (a police officer or anyone else) with no ammo left at all (magazine empty and no reloads), the eat key (E) kills them silently. They drop as a ragdoll, the bird hops off, and no one is alerted, since police only respond to gunfire, being run over and cars off the road. The ride prompt shows “E: Silent kill” when it is available. (Written, not yet tested in play.)</w:t>
+      </w:r>
+    </w:p>
+    <w:p>
+      <w:pPr>
+        <w:pStyle w:val="ListBullet"/>
+        <w:spacing w:after="40"/>
+      </w:pPr>
+      <w:r>
+        <w:t xml:space="preserve">Park bird flocks take off ahead of a vehicle coming at them; a bird still on the ground when it arrives is knocked flying.</w:t>
+      </w:r>
+    </w:p>
+    <w:p>
+      <w:pPr>
+        <w:pStyle w:val="ListBullet"/>
+        <w:spacing w:after="40"/>
+      </w:pPr>
+      <w:r>
+        <w:t xml:space="preserve">Loose physics objects (ragdolls, dead birds, knocked-over vehicles) are shoved by mass (bike 25 kg, car 1400 kg). A parked bike or car that gets hit tumbles under physics, then rights itself once still and can be ridden again. Walls, benches and other scenery without physics stop a vehicle.</w:t>
+      </w:r>
+    </w:p>
+    <w:p>
+      <w:pPr>
+        <w:pStyle w:val="ListBullet"/>
+        <w:spacing w:after="40"/>
+      </w:pPr>
+      <w:r>
+        <w:t xml:space="preserve">Written, not yet tested in play.</w:t>
+      </w:r>
+    </w:p>
+    <w:p>
+      <w:pPr>
+        <w:pStyle w:val="Heading2"/>
+      </w:pPr>
+      <w:r>
+        <w:t>Hunt Gym (test arena)</w:t>
+      </w:r>
+    </w:p>
+    <w:p>
+      <w:pPr>
+        <w:pStyle w:val="ListBullet"/>
+        <w:spacing w:after="40"/>
+      </w:pPr>
+      <w:r>
+        <w:t xml:space="preserve">A small walled arena used to test online matches, with the fountain, a chess table and the arch for the tasks.</w:t>
+      </w:r>
+    </w:p>
+    <w:p>
+      <w:pPr>
+        <w:pStyle w:val="ListBullet"/>
+        <w:spacing w:after="40"/>
+      </w:pPr>
+      <w:r>
+        <w:t xml:space="preserve">Settings (Tools &gt; Wash Square &gt; Hunt Gym Settings) has sliders for the amount of cover and spacing, the mix of walls, blocks, pillars and benches, each kind of cart and truck, each kind of stray food, the NPC food drop chance, pigeon and seagull flocks, each kind of person, each kind of car, loose Citi Bikes, and Citi Bike stations (how many, docks per station, and how full). The layout seed can be fixed to repeat a layout.</w:t>
+      </w:r>
+    </w:p>
+    <w:p>
+      <w:pPr>
+        <w:pStyle w:val="ListBullet"/>
+        <w:spacing w:after="40"/>
+      </w:pPr>
+      <w:r>
+        <w:t xml:space="preserve">Apply to Hunt Gym (or Tools &gt; Wash Square &gt; Reshuffle Hunt Gym Cover) scatters a new layout, re-bakes the walkable area and saves the scene.</w:t>
+      </w:r>
+    </w:p>
+    <w:p>
+      <w:pPr>
+        <w:pStyle w:val="Heading2"/>
+      </w:pPr>
+      <w:r>
+        <w:t>Wash Square Hunt (the full map)</w:t>
+      </w:r>
+    </w:p>
+    <w:p>
+      <w:pPr>
+        <w:pStyle w:val="ListBullet"/>
+        <w:spacing w:after="40"/>
+      </w:pPr>
+      <w:r>
+        <w:t xml:space="preserve">Scenes/WashSquareHunt is the whole Washington Square map with everything the Hunt Gym has: the online match, the three Seagull tasks, cars and Citi Bikes. Tools &gt; Wash Square &gt; Build Wash Square Hunt makes it as a copy of WashSquareGym, which stays as it was; running it again rebuilds it.</w:t>
+      </w:r>
+    </w:p>
+    <w:p>
+      <w:pPr>
+        <w:pStyle w:val="ListBullet"/>
+        <w:spacing w:after="40"/>
+      </w:pPr>
+      <w:r>
+        <w:t xml:space="preserve">The tasks are on the real landmarks: bathe in the Washington Square fountain (5 s), stand on the chess table nearest the fountain (3 s), and perch on top of the arch (3 s).</w:t>
+      </w:r>
+    </w:p>
+    <w:p>
+      <w:pPr>
+        <w:pStyle w:val="ListBullet"/>
+        <w:spacing w:after="40"/>
+      </w:pPr>
+      <w:r>
+        <w:t xml:space="preserve">The Pigeon starts where the player stands in WashSquareGym, and the Seagull starts the same distance away on the far side of the fountain. One offline stand-in seagull is kept; the map's other stand-ins are switched off.</w:t>
+      </w:r>
+    </w:p>
+    <w:p>
+      <w:pPr>
+        <w:pStyle w:val="ListBullet"/>
+        <w:spacing w:after="40"/>
+      </w:pPr>
+      <w:r>
+        <w:t xml:space="preserve">Wash Square Hunt Settings (Tools &gt; Wash Square &gt; Wash Square Hunt Settings, then Apply) re-places everything with a new layout, each only where its kind belongs: food trucks and Citi Bike stations in the parking lanes round the park, wholly on the road (trucks with the hatch to the park); carts on the park paths with their backs to a path edge and room to queue in front; loose Citi Bikes on the paving; pizza on chess tables; bagels and bread on bench seats. Nothing is placed overlapping anything solid, or on a task spot or spawn. Sliders set how many of each, plus the people and flocks; the seed can be fixed to repeat a layout. The scene bakes its own walkable area around it all. People keep to the park paths and the pavements, off the grass and out of the road, even when they panic; police cut across anything while chasing someone and walk back to a path afterwards. Traffic (Wash Square Hunt only): no car is parked; every car the sliders ask for (24 by default) drives one way round the park in the outer lane at about 8 m/s, starting at least 15 m apart. They slow for corners, queue behind the car in front and brake for people and anything fixed ahead; something that is not traffic and stays in the way for 4 s gets pushed through slowly. Park birds, bodies and loose food do not stop them. Land on one to take it over; hop off and it carries on round. Each game runs its own traffic; it is not synced online.</w:t>
+      </w:r>
+    </w:p>
+    <w:p>
+      <w:pPr>
+        <w:pStyle w:val="ListBullet"/>
+        <w:spacing w:after="40"/>
+      </w:pPr>
+      <w:r>
+        <w:t xml:space="preserve">Written, not yet built or tested in play.</w:t>
+      </w:r>
+    </w:p>
+    <w:p>
+      <w:pPr>
+        <w:pStyle w:val="Heading2"/>
+      </w:pPr>
+      <w:r>
+        <w:t>Ground Surfaces (art)</w:t>
+      </w:r>
+    </w:p>
+    <w:p>
+      <w:pPr>
+        <w:pStyle w:val="ListBullet"/>
+        <w:spacing w:after="40"/>
+      </w:pPr>
+      <w:r>
+        <w:t xml:space="preserve">The park paving, the pavements and the roads have real displacement, like Unreal Engine 5’s: the Shitshow/Lit Displaced shader tessellates them on the GPU and pushes the surface up and down along a height map (paving 4 cm, asphalt 2.5 cm), so the stones and cracks have real depth and silhouette rather than only shading.</w:t>
+      </w:r>
+    </w:p>
+    <w:p>
+      <w:pPr>
+        <w:pStyle w:val="ListBullet"/>
+        <w:spacing w:after="40"/>
+      </w:pPr>
+      <w:r>
+        <w:t xml:space="preserve">Detail is by distance: up to 64 splits per edge close to the camera, none past 30 m, and nothing off screen. Shadows are cast from the flat surface to save frame time. On import the blockout cuts those ground pieces into a 4 m grid (shared edges cut at the same points, so no cracks open).</w:t>
+      </w:r>
+    </w:p>
+    <w:p>
+      <w:pPr>
+        <w:pStyle w:val="ListBullet"/>
+        <w:spacing w:after="40"/>
+      </w:pPr>
+      <w:r>
+        <w:t xml:space="preserve">Material settings: Height (metres from lowest to highest), Detail (triangle size in metres; lower is finer and slower), Most Splits per Edge and No Subdividing Beyond (metres). If frame rate suffers, raise Detail, lower the distance, or switch the material back to URP Lit.</w:t>
       </w:r>
     </w:p>
     <w:sectPr>

</xml_diff>